<commit_message>
Corrige total de dados
- Corrige o total de dados no arquivo de resultados
</commit_message>
<xml_diff>
--- a/algoritmos/resultados_regressao_filmes.docx
+++ b/algoritmos/resultados_regressao_filmes.docx
@@ -20,8 +20,8 @@
       <w:tblGrid>
         <w:gridCol w:w="1670"/>
         <w:gridCol w:w="1006"/>
-        <w:gridCol w:w="1169"/>
-        <w:gridCol w:w="2387"/>
+        <w:gridCol w:w="1168"/>
+        <w:gridCol w:w="2388"/>
         <w:gridCol w:w="1882"/>
         <w:gridCol w:w="2204"/>
       </w:tblGrid>
@@ -44,6 +44,7 @@
             <w:pPr>
               <w:pStyle w:val="Normal"/>
               <w:widowControl/>
+              <w:suppressAutoHyphens w:val="true"/>
               <w:spacing w:lineRule="auto" w:line="240" w:before="0" w:after="0"/>
               <w:jc w:val="center"/>
               <w:rPr>
@@ -87,6 +88,7 @@
             <w:pPr>
               <w:pStyle w:val="Normal"/>
               <w:widowControl/>
+              <w:suppressAutoHyphens w:val="true"/>
               <w:spacing w:lineRule="auto" w:line="240" w:before="0" w:after="0"/>
               <w:jc w:val="start"/>
               <w:rPr>
@@ -126,6 +128,7 @@
             <w:pPr>
               <w:pStyle w:val="Normal"/>
               <w:widowControl/>
+              <w:suppressAutoHyphens w:val="true"/>
               <w:spacing w:lineRule="auto" w:line="240" w:before="0" w:after="0"/>
               <w:jc w:val="start"/>
               <w:rPr>
@@ -164,6 +167,7 @@
             <w:pPr>
               <w:pStyle w:val="Normal"/>
               <w:widowControl/>
+              <w:suppressAutoHyphens w:val="true"/>
               <w:spacing w:lineRule="auto" w:line="240" w:before="0" w:after="0"/>
               <w:jc w:val="start"/>
               <w:rPr>
@@ -202,6 +206,7 @@
             <w:pPr>
               <w:pStyle w:val="Normal"/>
               <w:widowControl/>
+              <w:suppressAutoHyphens w:val="true"/>
               <w:spacing w:lineRule="auto" w:line="240" w:before="0" w:after="0"/>
               <w:jc w:val="start"/>
               <w:rPr>
@@ -220,7 +225,7 @@
                 <w:szCs w:val="22"/>
                 <w:lang w:val="zxx" w:eastAsia="zxx" w:bidi="zxx"/>
               </w:rPr>
-              <w:t>21613</w:t>
+              <w:t>8554</w:t>
             </w:r>
           </w:p>
         </w:tc>
@@ -240,6 +245,7 @@
             <w:pPr>
               <w:pStyle w:val="Normal"/>
               <w:widowControl/>
+              <w:suppressAutoHyphens w:val="true"/>
               <w:spacing w:lineRule="auto" w:line="240" w:before="0" w:after="0"/>
               <w:jc w:val="start"/>
               <w:rPr>
@@ -278,6 +284,7 @@
             <w:pPr>
               <w:pStyle w:val="Normal"/>
               <w:widowControl/>
+              <w:suppressAutoHyphens w:val="true"/>
               <w:spacing w:lineRule="auto" w:line="240" w:before="0" w:after="0"/>
               <w:jc w:val="start"/>
               <w:rPr>
@@ -296,17 +303,7 @@
                 <w:szCs w:val="22"/>
                 <w:lang w:val="zxx" w:eastAsia="zxx" w:bidi="zxx"/>
               </w:rPr>
-              <w:t>1</w:t>
-            </w:r>
-            <w:r>
-              <w:rPr>
-                <w:rFonts w:eastAsia="Calibri" w:cs=""/>
-                <w:kern w:val="0"/>
-                <w:sz w:val="22"/>
-                <w:szCs w:val="22"/>
-                <w:lang w:val="zxx" w:eastAsia="zxx" w:bidi="zxx"/>
-              </w:rPr>
-              <w:t>0</w:t>
+              <w:t>10</w:t>
             </w:r>
           </w:p>
         </w:tc>
@@ -326,6 +323,7 @@
             <w:pPr>
               <w:pStyle w:val="Normal"/>
               <w:widowControl/>
+              <w:suppressAutoHyphens w:val="true"/>
               <w:spacing w:lineRule="auto" w:line="240" w:before="0" w:after="0"/>
               <w:jc w:val="start"/>
               <w:rPr>
@@ -364,6 +362,7 @@
             <w:pPr>
               <w:pStyle w:val="Normal"/>
               <w:widowControl/>
+              <w:suppressAutoHyphens w:val="true"/>
               <w:spacing w:lineRule="auto" w:line="240" w:before="0" w:after="0"/>
               <w:jc w:val="start"/>
               <w:rPr>
@@ -406,6 +405,7 @@
             <w:pPr>
               <w:pStyle w:val="Normal"/>
               <w:widowControl/>
+              <w:suppressAutoHyphens w:val="true"/>
               <w:spacing w:lineRule="auto" w:line="240" w:before="0" w:after="0"/>
               <w:jc w:val="center"/>
               <w:rPr>
@@ -451,6 +451,7 @@
             <w:pPr>
               <w:pStyle w:val="Normal"/>
               <w:widowControl/>
+              <w:suppressAutoHyphens w:val="true"/>
               <w:spacing w:lineRule="auto" w:line="240" w:before="0" w:after="0"/>
               <w:jc w:val="center"/>
               <w:rPr>
@@ -479,7 +480,7 @@
         </w:tc>
         <w:tc>
           <w:tcPr>
-            <w:tcW w:w="2175" w:type="dxa"/>
+            <w:tcW w:w="2174" w:type="dxa"/>
             <w:gridSpan w:val="2"/>
             <w:tcBorders>
               <w:top w:val="single" w:sz="24" w:space="0" w:color="000000"/>
@@ -491,6 +492,7 @@
             <w:pPr>
               <w:pStyle w:val="Normal"/>
               <w:widowControl/>
+              <w:suppressAutoHyphens w:val="true"/>
               <w:spacing w:lineRule="auto" w:line="240" w:before="0" w:after="0"/>
               <w:jc w:val="center"/>
               <w:rPr>
@@ -519,7 +521,7 @@
         </w:tc>
         <w:tc>
           <w:tcPr>
-            <w:tcW w:w="2387" w:type="dxa"/>
+            <w:tcW w:w="2388" w:type="dxa"/>
             <w:tcBorders>
               <w:top w:val="single" w:sz="24" w:space="0" w:color="000000"/>
             </w:tcBorders>
@@ -530,6 +532,7 @@
             <w:pPr>
               <w:pStyle w:val="Normal"/>
               <w:widowControl/>
+              <w:suppressAutoHyphens w:val="true"/>
               <w:spacing w:lineRule="auto" w:line="240" w:before="0" w:after="0"/>
               <w:jc w:val="center"/>
               <w:rPr>
@@ -569,6 +572,7 @@
             <w:pPr>
               <w:pStyle w:val="Normal"/>
               <w:widowControl/>
+              <w:suppressAutoHyphens w:val="true"/>
               <w:spacing w:lineRule="auto" w:line="240" w:before="0" w:after="0"/>
               <w:jc w:val="center"/>
               <w:rPr>
@@ -609,6 +613,7 @@
             <w:pPr>
               <w:pStyle w:val="Normal"/>
               <w:widowControl/>
+              <w:suppressAutoHyphens w:val="true"/>
               <w:spacing w:lineRule="auto" w:line="240" w:before="0" w:after="0"/>
               <w:jc w:val="center"/>
               <w:rPr>
@@ -652,6 +657,7 @@
             <w:pPr>
               <w:pStyle w:val="Normal"/>
               <w:widowControl/>
+              <w:suppressAutoHyphens w:val="true"/>
               <w:spacing w:lineRule="auto" w:line="240" w:before="0" w:after="0"/>
               <w:jc w:val="center"/>
               <w:rPr>
@@ -676,7 +682,7 @@
         </w:tc>
         <w:tc>
           <w:tcPr>
-            <w:tcW w:w="2175" w:type="dxa"/>
+            <w:tcW w:w="2174" w:type="dxa"/>
             <w:gridSpan w:val="2"/>
             <w:tcBorders/>
             <w:vAlign w:val="center"/>
@@ -685,6 +691,7 @@
             <w:pPr>
               <w:pStyle w:val="Normal"/>
               <w:widowControl/>
+              <w:suppressAutoHyphens w:val="true"/>
               <w:spacing w:lineRule="auto" w:line="240" w:before="0" w:after="0"/>
               <w:jc w:val="center"/>
               <w:rPr>
@@ -709,7 +716,7 @@
         </w:tc>
         <w:tc>
           <w:tcPr>
-            <w:tcW w:w="2387" w:type="dxa"/>
+            <w:tcW w:w="2388" w:type="dxa"/>
             <w:tcBorders/>
             <w:vAlign w:val="center"/>
           </w:tcPr>
@@ -717,6 +724,7 @@
             <w:pPr>
               <w:pStyle w:val="Normal"/>
               <w:widowControl/>
+              <w:suppressAutoHyphens w:val="true"/>
               <w:spacing w:lineRule="auto" w:line="240" w:before="0" w:after="0"/>
               <w:jc w:val="center"/>
               <w:rPr>
@@ -742,6 +750,7 @@
             <w:pPr>
               <w:pStyle w:val="Normal"/>
               <w:widowControl/>
+              <w:suppressAutoHyphens w:val="true"/>
               <w:spacing w:lineRule="auto" w:line="240" w:before="0" w:after="0"/>
               <w:jc w:val="center"/>
               <w:rPr>
@@ -774,6 +783,7 @@
             <w:pPr>
               <w:pStyle w:val="Normal"/>
               <w:widowControl/>
+              <w:suppressAutoHyphens w:val="true"/>
               <w:spacing w:lineRule="auto" w:line="240" w:before="0" w:after="0"/>
               <w:jc w:val="center"/>
               <w:rPr>
@@ -808,6 +818,7 @@
             <w:pPr>
               <w:pStyle w:val="Normal"/>
               <w:widowControl/>
+              <w:suppressAutoHyphens w:val="true"/>
               <w:spacing w:lineRule="auto" w:line="240" w:before="0" w:after="0"/>
               <w:jc w:val="center"/>
               <w:rPr>
@@ -845,6 +856,7 @@
             <w:pPr>
               <w:pStyle w:val="Normal"/>
               <w:widowControl/>
+              <w:suppressAutoHyphens w:val="true"/>
               <w:spacing w:lineRule="auto" w:line="240" w:before="0" w:after="0"/>
               <w:jc w:val="center"/>
               <w:rPr>
@@ -869,7 +881,7 @@
         </w:tc>
         <w:tc>
           <w:tcPr>
-            <w:tcW w:w="2175" w:type="dxa"/>
+            <w:tcW w:w="2174" w:type="dxa"/>
             <w:gridSpan w:val="2"/>
             <w:tcBorders/>
             <w:vAlign w:val="center"/>
@@ -878,6 +890,7 @@
             <w:pPr>
               <w:pStyle w:val="Normal"/>
               <w:widowControl/>
+              <w:suppressAutoHyphens w:val="true"/>
               <w:spacing w:lineRule="auto" w:line="240" w:before="0" w:after="0"/>
               <w:jc w:val="center"/>
               <w:rPr>
@@ -902,7 +915,7 @@
         </w:tc>
         <w:tc>
           <w:tcPr>
-            <w:tcW w:w="2387" w:type="dxa"/>
+            <w:tcW w:w="2388" w:type="dxa"/>
             <w:tcBorders/>
             <w:vAlign w:val="center"/>
           </w:tcPr>
@@ -910,6 +923,7 @@
             <w:pPr>
               <w:pStyle w:val="Normal"/>
               <w:widowControl/>
+              <w:suppressAutoHyphens w:val="true"/>
               <w:spacing w:lineRule="auto" w:line="240" w:before="0" w:after="0"/>
               <w:jc w:val="center"/>
               <w:rPr>
@@ -935,6 +949,7 @@
             <w:pPr>
               <w:pStyle w:val="Normal"/>
               <w:widowControl/>
+              <w:suppressAutoHyphens w:val="true"/>
               <w:spacing w:lineRule="auto" w:line="240" w:before="0" w:after="0"/>
               <w:jc w:val="center"/>
               <w:rPr>
@@ -960,6 +975,7 @@
             <w:pPr>
               <w:pStyle w:val="Normal"/>
               <w:widowControl/>
+              <w:suppressAutoHyphens w:val="true"/>
               <w:spacing w:lineRule="auto" w:line="240" w:before="0" w:after="0"/>
               <w:jc w:val="center"/>
               <w:rPr>
@@ -992,35 +1008,26 @@
             <w:pPr>
               <w:pStyle w:val="Normal"/>
               <w:widowControl/>
-              <w:spacing w:lineRule="auto" w:line="240" w:before="0" w:after="0"/>
-              <w:jc w:val="center"/>
-              <w:rPr>
-                <w:rFonts w:ascii="Calibri" w:hAnsi="Calibri" w:eastAsia="Calibri" w:cs=""/>
-                <w:kern w:val="0"/>
-                <w:sz w:val="22"/>
-                <w:szCs w:val="22"/>
-                <w:lang w:val="zxx" w:eastAsia="zxx" w:bidi="zxx"/>
-              </w:rPr>
-            </w:pPr>
-            <w:r>
-              <w:rPr>
-                <w:rFonts w:eastAsia="Calibri" w:cs=""/>
-                <w:kern w:val="0"/>
-                <w:sz w:val="22"/>
-                <w:szCs w:val="22"/>
-                <w:lang w:val="zxx" w:eastAsia="zxx" w:bidi="zxx"/>
-              </w:rPr>
-              <w:t>0.7043</w:t>
-            </w:r>
-            <w:r>
-              <w:rPr>
-                <w:rFonts w:eastAsia="Calibri" w:cs=""/>
-                <w:kern w:val="0"/>
-                <w:sz w:val="22"/>
-                <w:szCs w:val="22"/>
-                <w:lang w:val="zxx" w:eastAsia="zxx" w:bidi="zxx"/>
-              </w:rPr>
-              <w:t>0</w:t>
+              <w:suppressAutoHyphens w:val="true"/>
+              <w:spacing w:lineRule="auto" w:line="240" w:before="0" w:after="0"/>
+              <w:jc w:val="center"/>
+              <w:rPr>
+                <w:rFonts w:ascii="Calibri" w:hAnsi="Calibri" w:eastAsia="Calibri" w:cs=""/>
+                <w:kern w:val="0"/>
+                <w:sz w:val="22"/>
+                <w:szCs w:val="22"/>
+                <w:lang w:val="zxx" w:eastAsia="zxx" w:bidi="zxx"/>
+              </w:rPr>
+            </w:pPr>
+            <w:r>
+              <w:rPr>
+                <w:rFonts w:eastAsia="Calibri" w:cs=""/>
+                <w:kern w:val="0"/>
+                <w:sz w:val="22"/>
+                <w:szCs w:val="22"/>
+                <w:lang w:val="zxx" w:eastAsia="zxx" w:bidi="zxx"/>
+              </w:rPr>
+              <w:t>0.70430</w:t>
             </w:r>
           </w:p>
         </w:tc>
@@ -1036,6 +1043,7 @@
             <w:pPr>
               <w:pStyle w:val="Normal"/>
               <w:widowControl/>
+              <w:suppressAutoHyphens w:val="true"/>
               <w:spacing w:lineRule="auto" w:line="240" w:before="0" w:after="0"/>
               <w:jc w:val="center"/>
               <w:rPr>
@@ -1073,6 +1081,7 @@
             <w:pPr>
               <w:pStyle w:val="Normal"/>
               <w:widowControl/>
+              <w:suppressAutoHyphens w:val="true"/>
               <w:spacing w:lineRule="auto" w:line="240" w:before="0" w:after="0"/>
               <w:jc w:val="center"/>
               <w:rPr>
@@ -1097,7 +1106,7 @@
         </w:tc>
         <w:tc>
           <w:tcPr>
-            <w:tcW w:w="2175" w:type="dxa"/>
+            <w:tcW w:w="2174" w:type="dxa"/>
             <w:gridSpan w:val="2"/>
             <w:tcBorders/>
             <w:vAlign w:val="center"/>
@@ -1106,6 +1115,7 @@
             <w:pPr>
               <w:pStyle w:val="Normal"/>
               <w:widowControl/>
+              <w:suppressAutoHyphens w:val="true"/>
               <w:spacing w:lineRule="auto" w:line="240" w:before="0" w:after="0"/>
               <w:jc w:val="center"/>
               <w:rPr>
@@ -1130,7 +1140,7 @@
         </w:tc>
         <w:tc>
           <w:tcPr>
-            <w:tcW w:w="2387" w:type="dxa"/>
+            <w:tcW w:w="2388" w:type="dxa"/>
             <w:tcBorders/>
             <w:vAlign w:val="center"/>
           </w:tcPr>
@@ -1138,6 +1148,7 @@
             <w:pPr>
               <w:pStyle w:val="Normal"/>
               <w:widowControl/>
+              <w:suppressAutoHyphens w:val="true"/>
               <w:spacing w:lineRule="auto" w:line="240" w:before="0" w:after="0"/>
               <w:jc w:val="center"/>
               <w:rPr>
@@ -1163,6 +1174,7 @@
             <w:pPr>
               <w:pStyle w:val="Normal"/>
               <w:widowControl/>
+              <w:suppressAutoHyphens w:val="true"/>
               <w:spacing w:lineRule="auto" w:line="240" w:before="0" w:after="0"/>
               <w:jc w:val="center"/>
               <w:rPr>
@@ -1195,6 +1207,7 @@
             <w:pPr>
               <w:pStyle w:val="Normal"/>
               <w:widowControl/>
+              <w:suppressAutoHyphens w:val="true"/>
               <w:spacing w:lineRule="auto" w:line="240" w:before="0" w:after="0"/>
               <w:jc w:val="center"/>
               <w:rPr>
@@ -1229,6 +1242,7 @@
             <w:pPr>
               <w:pStyle w:val="Normal"/>
               <w:widowControl/>
+              <w:suppressAutoHyphens w:val="true"/>
               <w:spacing w:lineRule="auto" w:line="240" w:before="0" w:after="0"/>
               <w:jc w:val="center"/>
               <w:rPr>
@@ -1266,30 +1280,31 @@
             <w:pPr>
               <w:pStyle w:val="Normal"/>
               <w:widowControl/>
-              <w:spacing w:lineRule="auto" w:line="240" w:before="0" w:after="0"/>
-              <w:jc w:val="center"/>
-              <w:rPr>
-                <w:rFonts w:ascii="Calibri" w:hAnsi="Calibri" w:eastAsia="Calibri" w:cs=""/>
-                <w:kern w:val="0"/>
-                <w:sz w:val="22"/>
-                <w:szCs w:val="22"/>
-                <w:lang w:val="zxx" w:eastAsia="zxx" w:bidi="zxx"/>
-              </w:rPr>
-            </w:pPr>
-            <w:r>
-              <w:rPr>
-                <w:rFonts w:eastAsia="Calibri" w:cs=""/>
-                <w:kern w:val="0"/>
-                <w:sz w:val="22"/>
-                <w:szCs w:val="22"/>
-                <w:lang w:val="zxx" w:eastAsia="zxx" w:bidi="zxx"/>
-              </w:rPr>
-            </w:r>
-          </w:p>
-        </w:tc>
-        <w:tc>
-          <w:tcPr>
-            <w:tcW w:w="2175" w:type="dxa"/>
+              <w:suppressAutoHyphens w:val="true"/>
+              <w:spacing w:lineRule="auto" w:line="240" w:before="0" w:after="0"/>
+              <w:jc w:val="center"/>
+              <w:rPr>
+                <w:rFonts w:ascii="Calibri" w:hAnsi="Calibri" w:eastAsia="Calibri" w:cs=""/>
+                <w:kern w:val="0"/>
+                <w:sz w:val="22"/>
+                <w:szCs w:val="22"/>
+                <w:lang w:val="zxx" w:eastAsia="zxx" w:bidi="zxx"/>
+              </w:rPr>
+            </w:pPr>
+            <w:r>
+              <w:rPr>
+                <w:rFonts w:eastAsia="Calibri" w:cs=""/>
+                <w:kern w:val="0"/>
+                <w:sz w:val="22"/>
+                <w:szCs w:val="22"/>
+                <w:lang w:val="zxx" w:eastAsia="zxx" w:bidi="zxx"/>
+              </w:rPr>
+            </w:r>
+          </w:p>
+        </w:tc>
+        <w:tc>
+          <w:tcPr>
+            <w:tcW w:w="2174" w:type="dxa"/>
             <w:gridSpan w:val="2"/>
             <w:tcBorders/>
             <w:vAlign w:val="center"/>
@@ -1298,30 +1313,31 @@
             <w:pPr>
               <w:pStyle w:val="Normal"/>
               <w:widowControl/>
-              <w:spacing w:lineRule="auto" w:line="240" w:before="0" w:after="0"/>
-              <w:jc w:val="center"/>
-              <w:rPr>
-                <w:rFonts w:ascii="Calibri" w:hAnsi="Calibri" w:eastAsia="Calibri" w:cs=""/>
-                <w:kern w:val="0"/>
-                <w:sz w:val="22"/>
-                <w:szCs w:val="22"/>
-                <w:lang w:val="zxx" w:eastAsia="zxx" w:bidi="zxx"/>
-              </w:rPr>
-            </w:pPr>
-            <w:r>
-              <w:rPr>
-                <w:rFonts w:eastAsia="Calibri" w:cs=""/>
-                <w:kern w:val="0"/>
-                <w:sz w:val="22"/>
-                <w:szCs w:val="22"/>
-                <w:lang w:val="zxx" w:eastAsia="zxx" w:bidi="zxx"/>
-              </w:rPr>
-            </w:r>
-          </w:p>
-        </w:tc>
-        <w:tc>
-          <w:tcPr>
-            <w:tcW w:w="2387" w:type="dxa"/>
+              <w:suppressAutoHyphens w:val="true"/>
+              <w:spacing w:lineRule="auto" w:line="240" w:before="0" w:after="0"/>
+              <w:jc w:val="center"/>
+              <w:rPr>
+                <w:rFonts w:ascii="Calibri" w:hAnsi="Calibri" w:eastAsia="Calibri" w:cs=""/>
+                <w:kern w:val="0"/>
+                <w:sz w:val="22"/>
+                <w:szCs w:val="22"/>
+                <w:lang w:val="zxx" w:eastAsia="zxx" w:bidi="zxx"/>
+              </w:rPr>
+            </w:pPr>
+            <w:r>
+              <w:rPr>
+                <w:rFonts w:eastAsia="Calibri" w:cs=""/>
+                <w:kern w:val="0"/>
+                <w:sz w:val="22"/>
+                <w:szCs w:val="22"/>
+                <w:lang w:val="zxx" w:eastAsia="zxx" w:bidi="zxx"/>
+              </w:rPr>
+            </w:r>
+          </w:p>
+        </w:tc>
+        <w:tc>
+          <w:tcPr>
+            <w:tcW w:w="2388" w:type="dxa"/>
             <w:tcBorders/>
             <w:vAlign w:val="center"/>
           </w:tcPr>
@@ -1329,6 +1345,7 @@
             <w:pPr>
               <w:pStyle w:val="Normal"/>
               <w:widowControl/>
+              <w:suppressAutoHyphens w:val="true"/>
               <w:spacing w:lineRule="auto" w:line="240" w:before="0" w:after="0"/>
               <w:jc w:val="center"/>
               <w:rPr>
@@ -1360,6 +1377,7 @@
             <w:pPr>
               <w:pStyle w:val="Normal"/>
               <w:widowControl/>
+              <w:suppressAutoHyphens w:val="true"/>
               <w:spacing w:lineRule="auto" w:line="240" w:before="0" w:after="0"/>
               <w:jc w:val="center"/>
               <w:rPr>
@@ -1393,6 +1411,7 @@
             <w:pPr>
               <w:pStyle w:val="Normal"/>
               <w:widowControl/>
+              <w:suppressAutoHyphens w:val="true"/>
               <w:spacing w:lineRule="auto" w:line="240" w:before="0" w:after="0"/>
               <w:jc w:val="center"/>
               <w:rPr>
@@ -1429,30 +1448,31 @@
             <w:pPr>
               <w:pStyle w:val="Normal"/>
               <w:widowControl/>
-              <w:spacing w:lineRule="auto" w:line="240" w:before="0" w:after="0"/>
-              <w:jc w:val="center"/>
-              <w:rPr>
-                <w:rFonts w:ascii="Calibri" w:hAnsi="Calibri" w:eastAsia="Calibri" w:cs=""/>
-                <w:kern w:val="0"/>
-                <w:sz w:val="22"/>
-                <w:szCs w:val="22"/>
-                <w:lang w:val="zxx" w:eastAsia="zxx" w:bidi="zxx"/>
-              </w:rPr>
-            </w:pPr>
-            <w:r>
-              <w:rPr>
-                <w:rFonts w:eastAsia="Calibri" w:cs=""/>
-                <w:kern w:val="0"/>
-                <w:sz w:val="22"/>
-                <w:szCs w:val="22"/>
-                <w:lang w:val="zxx" w:eastAsia="zxx" w:bidi="zxx"/>
-              </w:rPr>
-            </w:r>
-          </w:p>
-        </w:tc>
-        <w:tc>
-          <w:tcPr>
-            <w:tcW w:w="2175" w:type="dxa"/>
+              <w:suppressAutoHyphens w:val="true"/>
+              <w:spacing w:lineRule="auto" w:line="240" w:before="0" w:after="0"/>
+              <w:jc w:val="center"/>
+              <w:rPr>
+                <w:rFonts w:ascii="Calibri" w:hAnsi="Calibri" w:eastAsia="Calibri" w:cs=""/>
+                <w:kern w:val="0"/>
+                <w:sz w:val="22"/>
+                <w:szCs w:val="22"/>
+                <w:lang w:val="zxx" w:eastAsia="zxx" w:bidi="zxx"/>
+              </w:rPr>
+            </w:pPr>
+            <w:r>
+              <w:rPr>
+                <w:rFonts w:eastAsia="Calibri" w:cs=""/>
+                <w:kern w:val="0"/>
+                <w:sz w:val="22"/>
+                <w:szCs w:val="22"/>
+                <w:lang w:val="zxx" w:eastAsia="zxx" w:bidi="zxx"/>
+              </w:rPr>
+            </w:r>
+          </w:p>
+        </w:tc>
+        <w:tc>
+          <w:tcPr>
+            <w:tcW w:w="2174" w:type="dxa"/>
             <w:gridSpan w:val="2"/>
             <w:tcBorders/>
             <w:vAlign w:val="center"/>
@@ -1461,30 +1481,31 @@
             <w:pPr>
               <w:pStyle w:val="Normal"/>
               <w:widowControl/>
-              <w:spacing w:lineRule="auto" w:line="240" w:before="0" w:after="0"/>
-              <w:jc w:val="center"/>
-              <w:rPr>
-                <w:rFonts w:ascii="Calibri" w:hAnsi="Calibri" w:eastAsia="Calibri" w:cs=""/>
-                <w:kern w:val="0"/>
-                <w:sz w:val="22"/>
-                <w:szCs w:val="22"/>
-                <w:lang w:val="zxx" w:eastAsia="zxx" w:bidi="zxx"/>
-              </w:rPr>
-            </w:pPr>
-            <w:r>
-              <w:rPr>
-                <w:rFonts w:eastAsia="Calibri" w:cs=""/>
-                <w:kern w:val="0"/>
-                <w:sz w:val="22"/>
-                <w:szCs w:val="22"/>
-                <w:lang w:val="zxx" w:eastAsia="zxx" w:bidi="zxx"/>
-              </w:rPr>
-            </w:r>
-          </w:p>
-        </w:tc>
-        <w:tc>
-          <w:tcPr>
-            <w:tcW w:w="2387" w:type="dxa"/>
+              <w:suppressAutoHyphens w:val="true"/>
+              <w:spacing w:lineRule="auto" w:line="240" w:before="0" w:after="0"/>
+              <w:jc w:val="center"/>
+              <w:rPr>
+                <w:rFonts w:ascii="Calibri" w:hAnsi="Calibri" w:eastAsia="Calibri" w:cs=""/>
+                <w:kern w:val="0"/>
+                <w:sz w:val="22"/>
+                <w:szCs w:val="22"/>
+                <w:lang w:val="zxx" w:eastAsia="zxx" w:bidi="zxx"/>
+              </w:rPr>
+            </w:pPr>
+            <w:r>
+              <w:rPr>
+                <w:rFonts w:eastAsia="Calibri" w:cs=""/>
+                <w:kern w:val="0"/>
+                <w:sz w:val="22"/>
+                <w:szCs w:val="22"/>
+                <w:lang w:val="zxx" w:eastAsia="zxx" w:bidi="zxx"/>
+              </w:rPr>
+            </w:r>
+          </w:p>
+        </w:tc>
+        <w:tc>
+          <w:tcPr>
+            <w:tcW w:w="2388" w:type="dxa"/>
             <w:tcBorders/>
             <w:vAlign w:val="center"/>
           </w:tcPr>
@@ -1492,6 +1513,7 @@
             <w:pPr>
               <w:pStyle w:val="Normal"/>
               <w:widowControl/>
+              <w:suppressAutoHyphens w:val="true"/>
               <w:spacing w:lineRule="auto" w:line="240" w:before="0" w:after="0"/>
               <w:jc w:val="center"/>
               <w:rPr>
@@ -1523,6 +1545,7 @@
             <w:pPr>
               <w:pStyle w:val="Normal"/>
               <w:widowControl/>
+              <w:suppressAutoHyphens w:val="true"/>
               <w:spacing w:lineRule="auto" w:line="240" w:before="0" w:after="0"/>
               <w:jc w:val="center"/>
               <w:rPr>
@@ -1556,6 +1579,7 @@
             <w:pPr>
               <w:pStyle w:val="Normal"/>
               <w:widowControl/>
+              <w:suppressAutoHyphens w:val="true"/>
               <w:spacing w:lineRule="auto" w:line="240" w:before="0" w:after="0"/>
               <w:jc w:val="center"/>
               <w:rPr>
@@ -1592,30 +1616,31 @@
             <w:pPr>
               <w:pStyle w:val="Normal"/>
               <w:widowControl/>
-              <w:spacing w:lineRule="auto" w:line="240" w:before="0" w:after="0"/>
-              <w:jc w:val="center"/>
-              <w:rPr>
-                <w:rFonts w:ascii="Calibri" w:hAnsi="Calibri" w:eastAsia="Calibri" w:cs=""/>
-                <w:kern w:val="0"/>
-                <w:sz w:val="22"/>
-                <w:szCs w:val="22"/>
-                <w:lang w:val="zxx" w:eastAsia="zxx" w:bidi="zxx"/>
-              </w:rPr>
-            </w:pPr>
-            <w:r>
-              <w:rPr>
-                <w:rFonts w:eastAsia="Calibri" w:cs=""/>
-                <w:kern w:val="0"/>
-                <w:sz w:val="22"/>
-                <w:szCs w:val="22"/>
-                <w:lang w:val="zxx" w:eastAsia="zxx" w:bidi="zxx"/>
-              </w:rPr>
-            </w:r>
-          </w:p>
-        </w:tc>
-        <w:tc>
-          <w:tcPr>
-            <w:tcW w:w="2175" w:type="dxa"/>
+              <w:suppressAutoHyphens w:val="true"/>
+              <w:spacing w:lineRule="auto" w:line="240" w:before="0" w:after="0"/>
+              <w:jc w:val="center"/>
+              <w:rPr>
+                <w:rFonts w:ascii="Calibri" w:hAnsi="Calibri" w:eastAsia="Calibri" w:cs=""/>
+                <w:kern w:val="0"/>
+                <w:sz w:val="22"/>
+                <w:szCs w:val="22"/>
+                <w:lang w:val="zxx" w:eastAsia="zxx" w:bidi="zxx"/>
+              </w:rPr>
+            </w:pPr>
+            <w:r>
+              <w:rPr>
+                <w:rFonts w:eastAsia="Calibri" w:cs=""/>
+                <w:kern w:val="0"/>
+                <w:sz w:val="22"/>
+                <w:szCs w:val="22"/>
+                <w:lang w:val="zxx" w:eastAsia="zxx" w:bidi="zxx"/>
+              </w:rPr>
+            </w:r>
+          </w:p>
+        </w:tc>
+        <w:tc>
+          <w:tcPr>
+            <w:tcW w:w="2174" w:type="dxa"/>
             <w:gridSpan w:val="2"/>
             <w:tcBorders/>
             <w:vAlign w:val="center"/>
@@ -1624,30 +1649,31 @@
             <w:pPr>
               <w:pStyle w:val="Normal"/>
               <w:widowControl/>
-              <w:spacing w:lineRule="auto" w:line="240" w:before="0" w:after="0"/>
-              <w:jc w:val="center"/>
-              <w:rPr>
-                <w:rFonts w:ascii="Calibri" w:hAnsi="Calibri" w:eastAsia="Calibri" w:cs=""/>
-                <w:kern w:val="0"/>
-                <w:sz w:val="22"/>
-                <w:szCs w:val="22"/>
-                <w:lang w:val="zxx" w:eastAsia="zxx" w:bidi="zxx"/>
-              </w:rPr>
-            </w:pPr>
-            <w:r>
-              <w:rPr>
-                <w:rFonts w:eastAsia="Calibri" w:cs=""/>
-                <w:kern w:val="0"/>
-                <w:sz w:val="22"/>
-                <w:szCs w:val="22"/>
-                <w:lang w:val="zxx" w:eastAsia="zxx" w:bidi="zxx"/>
-              </w:rPr>
-            </w:r>
-          </w:p>
-        </w:tc>
-        <w:tc>
-          <w:tcPr>
-            <w:tcW w:w="2387" w:type="dxa"/>
+              <w:suppressAutoHyphens w:val="true"/>
+              <w:spacing w:lineRule="auto" w:line="240" w:before="0" w:after="0"/>
+              <w:jc w:val="center"/>
+              <w:rPr>
+                <w:rFonts w:ascii="Calibri" w:hAnsi="Calibri" w:eastAsia="Calibri" w:cs=""/>
+                <w:kern w:val="0"/>
+                <w:sz w:val="22"/>
+                <w:szCs w:val="22"/>
+                <w:lang w:val="zxx" w:eastAsia="zxx" w:bidi="zxx"/>
+              </w:rPr>
+            </w:pPr>
+            <w:r>
+              <w:rPr>
+                <w:rFonts w:eastAsia="Calibri" w:cs=""/>
+                <w:kern w:val="0"/>
+                <w:sz w:val="22"/>
+                <w:szCs w:val="22"/>
+                <w:lang w:val="zxx" w:eastAsia="zxx" w:bidi="zxx"/>
+              </w:rPr>
+            </w:r>
+          </w:p>
+        </w:tc>
+        <w:tc>
+          <w:tcPr>
+            <w:tcW w:w="2388" w:type="dxa"/>
             <w:tcBorders/>
             <w:vAlign w:val="center"/>
           </w:tcPr>
@@ -1655,6 +1681,7 @@
             <w:pPr>
               <w:pStyle w:val="Normal"/>
               <w:widowControl/>
+              <w:suppressAutoHyphens w:val="true"/>
               <w:spacing w:lineRule="auto" w:line="240" w:before="0" w:after="0"/>
               <w:jc w:val="center"/>
               <w:rPr>
@@ -1686,6 +1713,7 @@
             <w:pPr>
               <w:pStyle w:val="Normal"/>
               <w:widowControl/>
+              <w:suppressAutoHyphens w:val="true"/>
               <w:spacing w:lineRule="auto" w:line="240" w:before="0" w:after="0"/>
               <w:jc w:val="center"/>
               <w:rPr>
@@ -1719,6 +1747,7 @@
             <w:pPr>
               <w:pStyle w:val="Normal"/>
               <w:widowControl/>
+              <w:suppressAutoHyphens w:val="true"/>
               <w:spacing w:lineRule="auto" w:line="240" w:before="0" w:after="0"/>
               <w:jc w:val="center"/>
               <w:rPr>
@@ -1755,30 +1784,31 @@
             <w:pPr>
               <w:pStyle w:val="Normal"/>
               <w:widowControl/>
-              <w:spacing w:lineRule="auto" w:line="240" w:before="0" w:after="0"/>
-              <w:jc w:val="center"/>
-              <w:rPr>
-                <w:rFonts w:ascii="Calibri" w:hAnsi="Calibri" w:eastAsia="Calibri" w:cs=""/>
-                <w:kern w:val="0"/>
-                <w:sz w:val="22"/>
-                <w:szCs w:val="22"/>
-                <w:lang w:val="zxx" w:eastAsia="zxx" w:bidi="zxx"/>
-              </w:rPr>
-            </w:pPr>
-            <w:r>
-              <w:rPr>
-                <w:rFonts w:eastAsia="Calibri" w:cs=""/>
-                <w:kern w:val="0"/>
-                <w:sz w:val="22"/>
-                <w:szCs w:val="22"/>
-                <w:lang w:val="zxx" w:eastAsia="zxx" w:bidi="zxx"/>
-              </w:rPr>
-            </w:r>
-          </w:p>
-        </w:tc>
-        <w:tc>
-          <w:tcPr>
-            <w:tcW w:w="2175" w:type="dxa"/>
+              <w:suppressAutoHyphens w:val="true"/>
+              <w:spacing w:lineRule="auto" w:line="240" w:before="0" w:after="0"/>
+              <w:jc w:val="center"/>
+              <w:rPr>
+                <w:rFonts w:ascii="Calibri" w:hAnsi="Calibri" w:eastAsia="Calibri" w:cs=""/>
+                <w:kern w:val="0"/>
+                <w:sz w:val="22"/>
+                <w:szCs w:val="22"/>
+                <w:lang w:val="zxx" w:eastAsia="zxx" w:bidi="zxx"/>
+              </w:rPr>
+            </w:pPr>
+            <w:r>
+              <w:rPr>
+                <w:rFonts w:eastAsia="Calibri" w:cs=""/>
+                <w:kern w:val="0"/>
+                <w:sz w:val="22"/>
+                <w:szCs w:val="22"/>
+                <w:lang w:val="zxx" w:eastAsia="zxx" w:bidi="zxx"/>
+              </w:rPr>
+            </w:r>
+          </w:p>
+        </w:tc>
+        <w:tc>
+          <w:tcPr>
+            <w:tcW w:w="2174" w:type="dxa"/>
             <w:gridSpan w:val="2"/>
             <w:tcBorders/>
             <w:vAlign w:val="center"/>
@@ -1787,30 +1817,31 @@
             <w:pPr>
               <w:pStyle w:val="Normal"/>
               <w:widowControl/>
-              <w:spacing w:lineRule="auto" w:line="240" w:before="0" w:after="0"/>
-              <w:jc w:val="center"/>
-              <w:rPr>
-                <w:rFonts w:ascii="Calibri" w:hAnsi="Calibri" w:eastAsia="Calibri" w:cs=""/>
-                <w:kern w:val="0"/>
-                <w:sz w:val="22"/>
-                <w:szCs w:val="22"/>
-                <w:lang w:val="zxx" w:eastAsia="zxx" w:bidi="zxx"/>
-              </w:rPr>
-            </w:pPr>
-            <w:r>
-              <w:rPr>
-                <w:rFonts w:eastAsia="Calibri" w:cs=""/>
-                <w:kern w:val="0"/>
-                <w:sz w:val="22"/>
-                <w:szCs w:val="22"/>
-                <w:lang w:val="zxx" w:eastAsia="zxx" w:bidi="zxx"/>
-              </w:rPr>
-            </w:r>
-          </w:p>
-        </w:tc>
-        <w:tc>
-          <w:tcPr>
-            <w:tcW w:w="2387" w:type="dxa"/>
+              <w:suppressAutoHyphens w:val="true"/>
+              <w:spacing w:lineRule="auto" w:line="240" w:before="0" w:after="0"/>
+              <w:jc w:val="center"/>
+              <w:rPr>
+                <w:rFonts w:ascii="Calibri" w:hAnsi="Calibri" w:eastAsia="Calibri" w:cs=""/>
+                <w:kern w:val="0"/>
+                <w:sz w:val="22"/>
+                <w:szCs w:val="22"/>
+                <w:lang w:val="zxx" w:eastAsia="zxx" w:bidi="zxx"/>
+              </w:rPr>
+            </w:pPr>
+            <w:r>
+              <w:rPr>
+                <w:rFonts w:eastAsia="Calibri" w:cs=""/>
+                <w:kern w:val="0"/>
+                <w:sz w:val="22"/>
+                <w:szCs w:val="22"/>
+                <w:lang w:val="zxx" w:eastAsia="zxx" w:bidi="zxx"/>
+              </w:rPr>
+            </w:r>
+          </w:p>
+        </w:tc>
+        <w:tc>
+          <w:tcPr>
+            <w:tcW w:w="2388" w:type="dxa"/>
             <w:tcBorders/>
             <w:vAlign w:val="center"/>
           </w:tcPr>
@@ -1818,6 +1849,7 @@
             <w:pPr>
               <w:pStyle w:val="Normal"/>
               <w:widowControl/>
+              <w:suppressAutoHyphens w:val="true"/>
               <w:spacing w:lineRule="auto" w:line="240" w:before="0" w:after="0"/>
               <w:jc w:val="center"/>
               <w:rPr>
@@ -1849,6 +1881,7 @@
             <w:pPr>
               <w:pStyle w:val="Normal"/>
               <w:widowControl/>
+              <w:suppressAutoHyphens w:val="true"/>
               <w:spacing w:lineRule="auto" w:line="240" w:before="0" w:after="0"/>
               <w:jc w:val="center"/>
               <w:rPr>
@@ -1882,6 +1915,7 @@
             <w:pPr>
               <w:pStyle w:val="Normal"/>
               <w:widowControl/>
+              <w:suppressAutoHyphens w:val="true"/>
               <w:spacing w:lineRule="auto" w:line="240" w:before="0" w:after="0"/>
               <w:jc w:val="center"/>
               <w:rPr>
@@ -1919,30 +1953,31 @@
             <w:pPr>
               <w:pStyle w:val="Normal"/>
               <w:widowControl/>
-              <w:spacing w:lineRule="auto" w:line="240" w:before="0" w:after="0"/>
-              <w:jc w:val="center"/>
-              <w:rPr>
-                <w:rFonts w:ascii="Calibri" w:hAnsi="Calibri" w:eastAsia="Calibri" w:cs=""/>
-                <w:kern w:val="0"/>
-                <w:sz w:val="22"/>
-                <w:szCs w:val="22"/>
-                <w:lang w:val="zxx" w:eastAsia="zxx" w:bidi="zxx"/>
-              </w:rPr>
-            </w:pPr>
-            <w:r>
-              <w:rPr>
-                <w:rFonts w:eastAsia="Calibri" w:cs=""/>
-                <w:kern w:val="0"/>
-                <w:sz w:val="22"/>
-                <w:szCs w:val="22"/>
-                <w:lang w:val="zxx" w:eastAsia="zxx" w:bidi="zxx"/>
-              </w:rPr>
-            </w:r>
-          </w:p>
-        </w:tc>
-        <w:tc>
-          <w:tcPr>
-            <w:tcW w:w="2175" w:type="dxa"/>
+              <w:suppressAutoHyphens w:val="true"/>
+              <w:spacing w:lineRule="auto" w:line="240" w:before="0" w:after="0"/>
+              <w:jc w:val="center"/>
+              <w:rPr>
+                <w:rFonts w:ascii="Calibri" w:hAnsi="Calibri" w:eastAsia="Calibri" w:cs=""/>
+                <w:kern w:val="0"/>
+                <w:sz w:val="22"/>
+                <w:szCs w:val="22"/>
+                <w:lang w:val="zxx" w:eastAsia="zxx" w:bidi="zxx"/>
+              </w:rPr>
+            </w:pPr>
+            <w:r>
+              <w:rPr>
+                <w:rFonts w:eastAsia="Calibri" w:cs=""/>
+                <w:kern w:val="0"/>
+                <w:sz w:val="22"/>
+                <w:szCs w:val="22"/>
+                <w:lang w:val="zxx" w:eastAsia="zxx" w:bidi="zxx"/>
+              </w:rPr>
+            </w:r>
+          </w:p>
+        </w:tc>
+        <w:tc>
+          <w:tcPr>
+            <w:tcW w:w="2174" w:type="dxa"/>
             <w:gridSpan w:val="2"/>
             <w:tcBorders>
               <w:bottom w:val="single" w:sz="24" w:space="0" w:color="000000"/>
@@ -1953,30 +1988,31 @@
             <w:pPr>
               <w:pStyle w:val="Normal"/>
               <w:widowControl/>
-              <w:spacing w:lineRule="auto" w:line="240" w:before="0" w:after="0"/>
-              <w:jc w:val="center"/>
-              <w:rPr>
-                <w:rFonts w:ascii="Calibri" w:hAnsi="Calibri" w:eastAsia="Calibri" w:cs=""/>
-                <w:kern w:val="0"/>
-                <w:sz w:val="22"/>
-                <w:szCs w:val="22"/>
-                <w:lang w:val="zxx" w:eastAsia="zxx" w:bidi="zxx"/>
-              </w:rPr>
-            </w:pPr>
-            <w:r>
-              <w:rPr>
-                <w:rFonts w:eastAsia="Calibri" w:cs=""/>
-                <w:kern w:val="0"/>
-                <w:sz w:val="22"/>
-                <w:szCs w:val="22"/>
-                <w:lang w:val="zxx" w:eastAsia="zxx" w:bidi="zxx"/>
-              </w:rPr>
-            </w:r>
-          </w:p>
-        </w:tc>
-        <w:tc>
-          <w:tcPr>
-            <w:tcW w:w="2387" w:type="dxa"/>
+              <w:suppressAutoHyphens w:val="true"/>
+              <w:spacing w:lineRule="auto" w:line="240" w:before="0" w:after="0"/>
+              <w:jc w:val="center"/>
+              <w:rPr>
+                <w:rFonts w:ascii="Calibri" w:hAnsi="Calibri" w:eastAsia="Calibri" w:cs=""/>
+                <w:kern w:val="0"/>
+                <w:sz w:val="22"/>
+                <w:szCs w:val="22"/>
+                <w:lang w:val="zxx" w:eastAsia="zxx" w:bidi="zxx"/>
+              </w:rPr>
+            </w:pPr>
+            <w:r>
+              <w:rPr>
+                <w:rFonts w:eastAsia="Calibri" w:cs=""/>
+                <w:kern w:val="0"/>
+                <w:sz w:val="22"/>
+                <w:szCs w:val="22"/>
+                <w:lang w:val="zxx" w:eastAsia="zxx" w:bidi="zxx"/>
+              </w:rPr>
+            </w:r>
+          </w:p>
+        </w:tc>
+        <w:tc>
+          <w:tcPr>
+            <w:tcW w:w="2388" w:type="dxa"/>
             <w:tcBorders>
               <w:bottom w:val="single" w:sz="24" w:space="0" w:color="000000"/>
             </w:tcBorders>
@@ -1986,6 +2022,7 @@
             <w:pPr>
               <w:pStyle w:val="Normal"/>
               <w:widowControl/>
+              <w:suppressAutoHyphens w:val="true"/>
               <w:spacing w:lineRule="auto" w:line="240" w:before="0" w:after="0"/>
               <w:jc w:val="center"/>
               <w:rPr>
@@ -2019,6 +2056,7 @@
             <w:pPr>
               <w:pStyle w:val="Normal"/>
               <w:widowControl/>
+              <w:suppressAutoHyphens w:val="true"/>
               <w:spacing w:lineRule="auto" w:line="240" w:before="0" w:after="0"/>
               <w:jc w:val="center"/>
               <w:rPr>
@@ -2053,6 +2091,7 @@
             <w:pPr>
               <w:pStyle w:val="Normal"/>
               <w:widowControl/>
+              <w:suppressAutoHyphens w:val="true"/>
               <w:spacing w:lineRule="auto" w:line="240" w:before="0" w:after="0"/>
               <w:jc w:val="center"/>
               <w:rPr>
@@ -2555,6 +2594,7 @@
     <w:qFormat/>
     <w:pPr>
       <w:widowControl/>
+      <w:suppressAutoHyphens w:val="true"/>
       <w:bidi w:val="0"/>
       <w:spacing w:lineRule="auto" w:line="259" w:before="0" w:after="160"/>
       <w:jc w:val="start"/>
@@ -2641,8 +2681,34 @@
       <w:rFonts w:cs="Lucida Sans"/>
     </w:rPr>
   </w:style>
-  <w:style w:type="paragraph" w:styleId="Contedodatabela">
-    <w:name w:val="Conteúdo da tabela"/>
+  <w:style w:type="paragraph" w:styleId="Ttulouser">
+    <w:name w:val="Título (user)"/>
+    <w:basedOn w:val="Normal"/>
+    <w:next w:val="BodyText"/>
+    <w:qFormat/>
+    <w:pPr>
+      <w:keepNext w:val="true"/>
+      <w:spacing w:before="240" w:after="120"/>
+    </w:pPr>
+    <w:rPr>
+      <w:rFonts w:ascii="Liberation Sans" w:hAnsi="Liberation Sans" w:eastAsia="Microsoft YaHei" w:cs="Lucida Sans"/>
+      <w:sz w:val="28"/>
+      <w:szCs w:val="28"/>
+    </w:rPr>
+  </w:style>
+  <w:style w:type="paragraph" w:styleId="ndiceuser">
+    <w:name w:val="Índice (user)"/>
+    <w:basedOn w:val="Normal"/>
+    <w:qFormat/>
+    <w:pPr>
+      <w:suppressLineNumbers/>
+    </w:pPr>
+    <w:rPr>
+      <w:rFonts w:cs="Lucida Sans"/>
+    </w:rPr>
+  </w:style>
+  <w:style w:type="paragraph" w:styleId="Contedodatabelauser">
+    <w:name w:val="Conteúdo da tabela (user)"/>
     <w:basedOn w:val="Normal"/>
     <w:qFormat/>
     <w:pPr>
@@ -2651,9 +2717,9 @@
     </w:pPr>
     <w:rPr/>
   </w:style>
-  <w:style w:type="paragraph" w:styleId="Ttulodetabela">
-    <w:name w:val="Título de tabela"/>
-    <w:basedOn w:val="Contedodatabela"/>
+  <w:style w:type="paragraph" w:styleId="Ttulodetabelauser">
+    <w:name w:val="Título de tabela (user)"/>
+    <w:basedOn w:val="Contedodatabelauser"/>
     <w:qFormat/>
     <w:pPr>
       <w:suppressLineNumbers/>
@@ -2664,8 +2730,8 @@
       <w:bCs/>
     </w:rPr>
   </w:style>
-  <w:style w:type="numbering" w:styleId="Semlista" w:default="1">
-    <w:name w:val="Sem lista"/>
+  <w:style w:type="numbering" w:styleId="Semlistauser" w:default="1">
+    <w:name w:val="Sem lista (user)"/>
     <w:uiPriority w:val="99"/>
     <w:semiHidden/>
     <w:unhideWhenUsed/>

</xml_diff>